<commit_message>
hub docs 57–60: Pilar confirma D1–Dn (WhatsApp 28-sep 13:06–13:15) en las 4 UST · Lucía pendiente (po265)
</commit_message>
<xml_diff>
--- a/_integration/docs/ust/UST-2026-09-27-22-wellness-state.docx
+++ b/_integration/docs/ust/UST-2026-09-27-22-wellness-state.docx
@@ -63,7 +63,7 @@
           <w:sz w:val="20"/>
           <w:szCs w:val="20"/>
         </w:rPr>
-        <w:t xml:space="preserve">PROPUESTA (27-sep). Pedido de las founders: «Queríamos hacer unos updates al app con el feedback que recibimos y aquí está el logic y falta que Lucía haga los nuevos screens». Este documento traduce la spec a lo que la app tiene HOY (tablas, pantallas, motor CAS) y marca dónde hay que decidir. No se construye nada hasta la aprobación fila a fila.</w:t>
+        <w:t xml:space="preserve">CONFIRMADA POR PILAR (WhatsApp 28-sep 13:10: D1–D8 «confirm») · PENDIENTE Lucía (producto: firman las dos) y Constanza (contenido). Sigue en propuesto hasta la firma de Lucía; entonces aceptado, y a sprint cuando haya contenido y pantallas (DoR 4). Propuesta original (27-sep): Pedido de las founders: «Queríamos hacer unos updates al app con el feedback que recibimos y aquí está el logic y falta que Lucía haga los nuevos screens». Este documento traduce la spec a lo que la app tiene HOY (tablas, pantallas, motor CAS) y marca dónde hay que decidir. No se construye nada hasta la aprobación fila a fila.</w:t>
       </w:r>
     </w:p>
     <w:p>
@@ -2456,7 +2456,7 @@
                 <w:sz w:val="16"/>
                 <w:szCs w:val="16"/>
               </w:rPr>
-              <w:t xml:space="preserve"/>
+              <w:t xml:space="preserve">CONFIRMADA por Pilar (WhatsApp 28-sep 13:10: «D1 confirm») · pendiente Lucía (producto: firman las dos)</w:t>
             </w:r>
           </w:p>
         </w:tc>
@@ -2570,7 +2570,7 @@
                 <w:sz w:val="16"/>
                 <w:szCs w:val="16"/>
               </w:rPr>
-              <w:t xml:space="preserve"/>
+              <w:t xml:space="preserve">CONFIRMADA por Pilar (WhatsApp 28-sep 13:10: «D2 confirm») · pendiente Lucía (producto: firman las dos)</w:t>
             </w:r>
           </w:p>
         </w:tc>
@@ -2684,7 +2684,7 @@
                 <w:sz w:val="16"/>
                 <w:szCs w:val="16"/>
               </w:rPr>
-              <w:t xml:space="preserve"/>
+              <w:t xml:space="preserve">CONFIRMADA por Pilar (WhatsApp 28-sep 13:10: «D3 confirm») · pendiente Lucía (producto: firman las dos)</w:t>
             </w:r>
           </w:p>
         </w:tc>
@@ -2798,7 +2798,7 @@
                 <w:sz w:val="16"/>
                 <w:szCs w:val="16"/>
               </w:rPr>
-              <w:t xml:space="preserve"/>
+              <w:t xml:space="preserve">CONFIRMADA por Pilar (WhatsApp 28-sep 13:10: «D4 confirm») · pendiente Lucía (producto: firman las dos)</w:t>
             </w:r>
           </w:p>
         </w:tc>
@@ -2912,7 +2912,7 @@
                 <w:sz w:val="16"/>
                 <w:szCs w:val="16"/>
               </w:rPr>
-              <w:t xml:space="preserve"/>
+              <w:t xml:space="preserve">CONFIRMADA por Pilar (WhatsApp 28-sep 13:10: «D5 confirm») · pendiente Lucía (producto: firman las dos)</w:t>
             </w:r>
           </w:p>
         </w:tc>
@@ -3026,7 +3026,7 @@
                 <w:sz w:val="16"/>
                 <w:szCs w:val="16"/>
               </w:rPr>
-              <w:t xml:space="preserve"/>
+              <w:t xml:space="preserve">CONFIRMADA por Pilar (WhatsApp 28-sep 13:10: «D6 confirm») · pendiente Lucía (producto: firman las dos)</w:t>
             </w:r>
           </w:p>
         </w:tc>
@@ -3140,7 +3140,7 @@
                 <w:sz w:val="16"/>
                 <w:szCs w:val="16"/>
               </w:rPr>
-              <w:t xml:space="preserve"/>
+              <w:t xml:space="preserve">CONFIRMADA por Pilar (WhatsApp 28-sep 13:10: «D7 confirm») · pendiente Lucía (producto: firman las dos)</w:t>
             </w:r>
           </w:p>
         </w:tc>
@@ -3254,7 +3254,7 @@
                 <w:sz w:val="16"/>
                 <w:szCs w:val="16"/>
               </w:rPr>
-              <w:t xml:space="preserve"/>
+              <w:t xml:space="preserve">CONFIRMADA por Pilar (WhatsApp 28-sep 13:10: «D8 confirm») · pendiente Lucía (producto: firman las dos) · pendiente Constanza (contenido)</w:t>
             </w:r>
           </w:p>
         </w:tc>
@@ -4622,7 +4622,7 @@
                 <w:sz w:val="16"/>
                 <w:szCs w:val="16"/>
               </w:rPr>
-              <w:t xml:space="preserve"/>
+              <w:t xml:space="preserve">SÍ — D1–D8 confirmadas por WhatsApp («D1 confirm D2 confirm D3 confirm D4 confirm D5 confirm D6 confirm D7 confirm D8 confirm»), 28-sep-2026 13:10</w:t>
             </w:r>
           </w:p>
         </w:tc>
@@ -4649,7 +4649,7 @@
                 <w:sz w:val="16"/>
                 <w:szCs w:val="16"/>
               </w:rPr>
-              <w:t xml:space="preserve"/>
+              <w:t xml:space="preserve">28-sep-2026 13:10</w:t>
             </w:r>
           </w:p>
         </w:tc>
@@ -4735,7 +4735,7 @@
                 <w:sz w:val="16"/>
                 <w:szCs w:val="16"/>
               </w:rPr>
-              <w:t xml:space="preserve"/>
+              <w:t xml:space="preserve">PENDIENTE (producto: firman las dos)</w:t>
             </w:r>
           </w:p>
         </w:tc>
@@ -4848,7 +4848,7 @@
                 <w:sz w:val="16"/>
                 <w:szCs w:val="16"/>
               </w:rPr>
-              <w:t xml:space="preserve"/>
+              <w:t xml:space="preserve">PENDIENTE (contenido / cortes)</w:t>
             </w:r>
           </w:p>
         </w:tc>

</xml_diff>

<commit_message>
Hub UST-22..25: docx, PDF, -SIGNED y cabecera HTML coherentes con la firma de las dos — para po267
Los .docx seguían en la versión del 28-sep («PENDIENTE Lucía»), los PDF del 29-sep llevaban
«Sigue en propuesto hasta la firma de Lucía» tras «FIRMADA por las DOS», y la cabecera de los
docs 57–60 decía «D1–Dn pendientes». Regenerados desde los datos corregidos (proyecto 29-sep
noche); PDF exportados con Word; nuevos .sha256. Lo pendiente de verdad (Constanza) se nombra fila a fila.

Además: los docs 57–60 (FIRMADA=true en mk-html) enlazan «PDF firmado» → …-SIGNED.pdf y su
.sha256, que no existían (web-linkcheck: 8 enlaces rotos; el deploy habría abortado). Se publican
con el patrón de UST-10/12/14/26: …-SIGNED.pdf (= el PDF firmado) + …-SIGNED.pdf.sha256 (solo el hash).
El .pdf de nombre base se conserva (mismo contenido) para no romper enlaces anteriores.

Co-Authored-By: Claude Opus 5.5 <noreply@anthropic.com>
</commit_message>
<xml_diff>
--- a/_integration/docs/ust/UST-2026-09-27-22-wellness-state.docx
+++ b/_integration/docs/ust/UST-2026-09-27-22-wellness-state.docx
@@ -63,7 +63,7 @@
           <w:sz w:val="20"/>
           <w:szCs w:val="20"/>
         </w:rPr>
-        <w:t xml:space="preserve">CONFIRMADA POR PILAR (WhatsApp 28-sep 13:10: D1–D8 «confirm») · PENDIENTE Lucía (producto: firman las dos) y Constanza (contenido). Sigue en propuesto hasta la firma de Lucía; entonces aceptado, y a sprint cuando haya contenido y pantallas (DoR 4). Propuesta original (27-sep): Pedido de las founders: «Queríamos hacer unos updates al app con el feedback que recibimos y aquí está el logic y falta que Lucía haga los nuevos screens». Este documento traduce la spec a lo que la app tiene HOY (tablas, pantallas, motor CAS) y marca dónde hay que decidir. No se construye nada hasta la aprobación fila a fila.</w:t>
+        <w:t xml:space="preserve">FIRMADA por las DOS founders: Pilar (WhatsApp 28-sep) y Lucía (29-sep, «firmó todo»). Estado tablero: ACEPTADO. Entra a sprint cuando cierren la DoR (contenido clínico de Constanza + pantallas de Lucía). Orden de construcción APP-1: 25 → 22 → 24 → 23 (releases 0.23.9+, se numeran al entrar a sprint). — Propuesta original (27-sep): Pedido de las founders: «Queríamos hacer unos updates al app con el feedback que recibimos y aquí está el logic y falta que Lucía haga los nuevos screens». Este documento traduce la spec a lo que la app tiene HOY (tablas, pantallas, motor CAS) y marca dónde hay que decidir. No se construye nada hasta la aprobación fila a fila.</w:t>
       </w:r>
     </w:p>
     <w:p>
@@ -2456,7 +2456,7 @@
                 <w:sz w:val="16"/>
                 <w:szCs w:val="16"/>
               </w:rPr>
-              <w:t xml:space="preserve">CONFIRMADA por Pilar (WhatsApp 28-sep 13:10: «D1 confirm») · pendiente Lucía (producto: firman las dos)</w:t>
+              <w:t xml:space="preserve">CONFIRMADA por Pilar (WhatsApp 28-sep 13:10: «D1 confirm») · Lucía ✓ (29-sep, «firmó todo») → FIRMADA por las dos</w:t>
             </w:r>
           </w:p>
         </w:tc>
@@ -2570,7 +2570,7 @@
                 <w:sz w:val="16"/>
                 <w:szCs w:val="16"/>
               </w:rPr>
-              <w:t xml:space="preserve">CONFIRMADA por Pilar (WhatsApp 28-sep 13:10: «D2 confirm») · pendiente Lucía (producto: firman las dos)</w:t>
+              <w:t xml:space="preserve">CONFIRMADA por Pilar (WhatsApp 28-sep 13:10: «D2 confirm») · Lucía ✓ (29-sep, «firmó todo») → FIRMADA por las dos</w:t>
             </w:r>
           </w:p>
         </w:tc>
@@ -2684,7 +2684,7 @@
                 <w:sz w:val="16"/>
                 <w:szCs w:val="16"/>
               </w:rPr>
-              <w:t xml:space="preserve">CONFIRMADA por Pilar (WhatsApp 28-sep 13:10: «D3 confirm») · pendiente Lucía (producto: firman las dos)</w:t>
+              <w:t xml:space="preserve">CONFIRMADA por Pilar (WhatsApp 28-sep 13:10: «D3 confirm») · Lucía ✓ (29-sep, «firmó todo») → FIRMADA por las dos</w:t>
             </w:r>
           </w:p>
         </w:tc>
@@ -2798,7 +2798,7 @@
                 <w:sz w:val="16"/>
                 <w:szCs w:val="16"/>
               </w:rPr>
-              <w:t xml:space="preserve">CONFIRMADA por Pilar (WhatsApp 28-sep 13:10: «D4 confirm») · pendiente Lucía (producto: firman las dos)</w:t>
+              <w:t xml:space="preserve">CONFIRMADA por Pilar (WhatsApp 28-sep 13:10: «D4 confirm») · Lucía ✓ (29-sep, «firmó todo») → FIRMADA por las dos</w:t>
             </w:r>
           </w:p>
         </w:tc>
@@ -2912,7 +2912,7 @@
                 <w:sz w:val="16"/>
                 <w:szCs w:val="16"/>
               </w:rPr>
-              <w:t xml:space="preserve">CONFIRMADA por Pilar (WhatsApp 28-sep 13:10: «D5 confirm») · pendiente Lucía (producto: firman las dos)</w:t>
+              <w:t xml:space="preserve">CONFIRMADA por Pilar (WhatsApp 28-sep 13:10: «D5 confirm») · Lucía ✓ (29-sep, «firmó todo») → FIRMADA por las dos</w:t>
             </w:r>
           </w:p>
         </w:tc>
@@ -3026,7 +3026,7 @@
                 <w:sz w:val="16"/>
                 <w:szCs w:val="16"/>
               </w:rPr>
-              <w:t xml:space="preserve">CONFIRMADA por Pilar (WhatsApp 28-sep 13:10: «D6 confirm») · pendiente Lucía (producto: firman las dos)</w:t>
+              <w:t xml:space="preserve">CONFIRMADA por Pilar (WhatsApp 28-sep 13:10: «D6 confirm») · Lucía ✓ (29-sep, «firmó todo») → FIRMADA por las dos</w:t>
             </w:r>
           </w:p>
         </w:tc>
@@ -3140,7 +3140,7 @@
                 <w:sz w:val="16"/>
                 <w:szCs w:val="16"/>
               </w:rPr>
-              <w:t xml:space="preserve">CONFIRMADA por Pilar (WhatsApp 28-sep 13:10: «D7 confirm») · pendiente Lucía (producto: firman las dos)</w:t>
+              <w:t xml:space="preserve">CONFIRMADA por Pilar (WhatsApp 28-sep 13:10: «D7 confirm») · Lucía ✓ (29-sep, «firmó todo») → FIRMADA por las dos</w:t>
             </w:r>
           </w:p>
         </w:tc>
@@ -3254,7 +3254,7 @@
                 <w:sz w:val="16"/>
                 <w:szCs w:val="16"/>
               </w:rPr>
-              <w:t xml:space="preserve">CONFIRMADA por Pilar (WhatsApp 28-sep 13:10: «D8 confirm») · pendiente Lucía (producto: firman las dos) · pendiente Constanza (contenido)</w:t>
+              <w:t xml:space="preserve">CONFIRMADA por Pilar (WhatsApp 28-sep 13:10: «D8 confirm») · Lucía ✓ (29-sep, «firmó todo») → FIRMADA por las dos · pendiente Constanza (contenido)</w:t>
             </w:r>
           </w:p>
         </w:tc>
@@ -4735,7 +4735,7 @@
                 <w:sz w:val="16"/>
                 <w:szCs w:val="16"/>
               </w:rPr>
-              <w:t xml:space="preserve">PENDIENTE (producto: firman las dos)</w:t>
+              <w:t xml:space="preserve">SÍ — firmó todo (Juanjo, 29-sep-2026)</w:t>
             </w:r>
           </w:p>
         </w:tc>
@@ -4762,7 +4762,7 @@
                 <w:sz w:val="16"/>
                 <w:szCs w:val="16"/>
               </w:rPr>
-              <w:t xml:space="preserve"/>
+              <w:t xml:space="preserve">29-sep-2026</w:t>
             </w:r>
           </w:p>
         </w:tc>
@@ -5016,10 +5016,6 @@
     </w:sectPr>
   </w:body>
 </w:document>
-</file>
-
-<file path=word/comments.xml><?xml version="1.0" encoding="utf-8"?>
-<w:comments xmlns:cx="http://schemas.microsoft.com/office/drawing/2014/chartex" xmlns:cx1="http://schemas.microsoft.com/office/drawing/2015/9/8/chartex" xmlns:cx2="http://schemas.microsoft.com/office/drawing/2015/10/21/chartex" xmlns:cx3="http://schemas.microsoft.com/office/drawing/2016/5/9/chartex" xmlns:cx4="http://schemas.microsoft.com/office/drawing/2016/5/10/chartex" xmlns:cx5="http://schemas.microsoft.com/office/drawing/2016/5/11/chartex" xmlns:cx6="http://schemas.microsoft.com/office/drawing/2016/5/12/chartex" xmlns:cx7="http://schemas.microsoft.com/office/drawing/2016/5/13/chartex" xmlns:cx8="http://schemas.microsoft.com/office/drawing/2016/5/14/chartex" xmlns:mc="http://schemas.openxmlformats.org/markup-compatibility/2006" xmlns:aink="http://schemas.microsoft.com/office/drawing/2016/ink" xmlns:am3d="http://schemas.microsoft.com/office/drawing/2017/model3d" xmlns:o="urn:schemas-microsoft-com:office:office" xmlns:r="http://schemas.openxmlformats.org/officeDocument/2006/relationships" xmlns:m="http://schemas.openxmlformats.org/officeDocument/2006/math" xmlns:v="urn:schemas-microsoft-com:vml" xmlns:wp14="http://schemas.microsoft.com/office/word/2010/wordprocessingDrawing" xmlns:wp="http://schemas.openxmlformats.org/drawingml/2006/wordprocessingDrawing" xmlns:w10="urn:schemas-microsoft-com:office:word" xmlns:w="http://schemas.openxmlformats.org/wordprocessingml/2006/main" xmlns:w14="http://schemas.microsoft.com/office/word/2010/wordml" xmlns:w15="http://schemas.microsoft.com/office/word/2012/wordml" xmlns:w16cex="http://schemas.microsoft.com/office/word/2018/wordml/cex" xmlns:w16cid="http://schemas.microsoft.com/office/word/2016/wordml/cid" xmlns:w16="http://schemas.microsoft.com/office/word/2018/wordml" xmlns:w16sdtdh="http://schemas.microsoft.com/office/word/2020/wordml/sdtdatahash" xmlns:w16se="http://schemas.microsoft.com/office/word/2015/wordml/symex" xmlns:wpg="http://schemas.microsoft.com/office/word/2010/wordprocessingGroup" xmlns:wpi="http://schemas.microsoft.com/office/word/2010/wordprocessingInk" xmlns:wne="http://schemas.microsoft.com/office/word/2006/wordml" xmlns:wps="http://schemas.microsoft.com/office/word/2010/wordprocessingShape"/>
 </file>
 
 <file path=word/endnotes.xml><?xml version="1.0" encoding="utf-8"?>
@@ -5100,7 +5096,7 @@
 <w:numbering xmlns:wpc="http://schemas.microsoft.com/office/word/2010/wordprocessingCanvas" xmlns:mc="http://schemas.openxmlformats.org/markup-compatibility/2006" xmlns:o="urn:schemas-microsoft-com:office:office" xmlns:r="http://schemas.openxmlformats.org/officeDocument/2006/relationships" xmlns:m="http://schemas.openxmlformats.org/officeDocument/2006/math" xmlns:v="urn:schemas-microsoft-com:vml" xmlns:wp14="http://schemas.microsoft.com/office/word/2010/wordprocessingDrawing" xmlns:wp="http://schemas.openxmlformats.org/drawingml/2006/wordprocessingDrawing" xmlns:w10="urn:schemas-microsoft-com:office:word" xmlns:w="http://schemas.openxmlformats.org/wordprocessingml/2006/main" xmlns:w14="http://schemas.microsoft.com/office/word/2010/wordml" xmlns:w15="http://schemas.microsoft.com/office/word/2012/wordml" xmlns:wpg="http://schemas.microsoft.com/office/word/2010/wordprocessingGroup" xmlns:wpi="http://schemas.microsoft.com/office/word/2010/wordprocessingInk" xmlns:wne="http://schemas.microsoft.com/office/word/2006/wordml" xmlns:wps="http://schemas.microsoft.com/office/word/2010/wordprocessingShape" mc:Ignorable="w14 w15 wp14">
   <w:abstractNum w:abstractNumId="1" w15:restartNumberingAfterBreak="0">
     <w:multiLevelType w:val="hybridMultilevel"/>
-    <w:lvl w:ilvl="0" w15:tentative="1">
+    <w:lvl w:ilvl="0" w:tentative="1">
       <w:start w:val="1"/>
       <w:numFmt w:val="bullet"/>
       <w:lvlText w:val="●"/>
@@ -5109,7 +5105,7 @@
         <w:ind w:left="720" w:hanging="360"/>
       </w:pPr>
     </w:lvl>
-    <w:lvl w:ilvl="1" w15:tentative="1">
+    <w:lvl w:ilvl="1" w:tentative="1">
       <w:start w:val="1"/>
       <w:numFmt w:val="bullet"/>
       <w:lvlText w:val="○"/>
@@ -5118,7 +5114,7 @@
         <w:ind w:left="1440" w:hanging="360"/>
       </w:pPr>
     </w:lvl>
-    <w:lvl w:ilvl="2" w15:tentative="1">
+    <w:lvl w:ilvl="2" w:tentative="1">
       <w:start w:val="1"/>
       <w:numFmt w:val="bullet"/>
       <w:lvlText w:val="■"/>
@@ -5127,7 +5123,7 @@
         <w:ind w:left="2160" w:hanging="360"/>
       </w:pPr>
     </w:lvl>
-    <w:lvl w:ilvl="3" w15:tentative="1">
+    <w:lvl w:ilvl="3" w:tentative="1">
       <w:start w:val="1"/>
       <w:numFmt w:val="bullet"/>
       <w:lvlText w:val="●"/>
@@ -5136,7 +5132,7 @@
         <w:ind w:left="2880" w:hanging="360"/>
       </w:pPr>
     </w:lvl>
-    <w:lvl w:ilvl="4" w15:tentative="1">
+    <w:lvl w:ilvl="4" w:tentative="1">
       <w:start w:val="1"/>
       <w:numFmt w:val="bullet"/>
       <w:lvlText w:val="○"/>
@@ -5145,7 +5141,7 @@
         <w:ind w:left="3600" w:hanging="360"/>
       </w:pPr>
     </w:lvl>
-    <w:lvl w:ilvl="5" w15:tentative="1">
+    <w:lvl w:ilvl="5" w:tentative="1">
       <w:start w:val="1"/>
       <w:numFmt w:val="bullet"/>
       <w:lvlText w:val="■"/>
@@ -5154,7 +5150,7 @@
         <w:ind w:left="4320" w:hanging="360"/>
       </w:pPr>
     </w:lvl>
-    <w:lvl w:ilvl="6" w15:tentative="1">
+    <w:lvl w:ilvl="6" w:tentative="1">
       <w:start w:val="1"/>
       <w:numFmt w:val="bullet"/>
       <w:lvlText w:val="●"/>
@@ -5163,7 +5159,7 @@
         <w:ind w:left="5040" w:hanging="360"/>
       </w:pPr>
     </w:lvl>
-    <w:lvl w:ilvl="7" w15:tentative="1">
+    <w:lvl w:ilvl="7" w:tentative="1">
       <w:start w:val="1"/>
       <w:numFmt w:val="bullet"/>
       <w:lvlText w:val="●"/>
@@ -5172,7 +5168,7 @@
         <w:ind w:left="5760" w:hanging="360"/>
       </w:pPr>
     </w:lvl>
-    <w:lvl w:ilvl="8" w15:tentative="1">
+    <w:lvl w:ilvl="8" w:tentative="1">
       <w:start w:val="1"/>
       <w:numFmt w:val="bullet"/>
       <w:lvlText w:val="●"/>
@@ -5204,6 +5200,10 @@
     </w:rPrDefault>
     <w:pPrDefault/>
   </w:docDefaults>
+  <w:style w:type="paragraph" w:styleId="Normal" w:default="1">
+    <w:name w:val="Normal"/>
+    <w:qFormat/>
+  </w:style>
   <w:style w:type="paragraph" w:styleId="Title">
     <w:name w:val="Title"/>
     <w:basedOn w:val="Normal"/>
@@ -5376,4 +5376,294 @@
     </w:rPr>
   </w:style>
 </w:styles>
+</file>
+
+<file path=word/theme/theme1.xml><?xml version="1.0" encoding="utf-8"?>
+<a:theme xmlns:a="http://schemas.openxmlformats.org/drawingml/2006/main" name="Office Theme">
+  <a:themeElements>
+    <a:clrScheme name="Office">
+      <a:dk1>
+        <a:sysClr val="windowText" lastClr="000000"/>
+      </a:dk1>
+      <a:lt1>
+        <a:sysClr val="window" lastClr="FFFFFF"/>
+      </a:lt1>
+      <a:dk2>
+        <a:srgbClr val="44546A"/>
+      </a:dk2>
+      <a:lt2>
+        <a:srgbClr val="E7E6E6"/>
+      </a:lt2>
+      <a:accent1>
+        <a:srgbClr val="4472C4"/>
+      </a:accent1>
+      <a:accent2>
+        <a:srgbClr val="ED7D31"/>
+      </a:accent2>
+      <a:accent3>
+        <a:srgbClr val="A5A5A5"/>
+      </a:accent3>
+      <a:accent4>
+        <a:srgbClr val="FFC000"/>
+      </a:accent4>
+      <a:accent5>
+        <a:srgbClr val="5B9BD5"/>
+      </a:accent5>
+      <a:accent6>
+        <a:srgbClr val="70AD47"/>
+      </a:accent6>
+      <a:hlink>
+        <a:srgbClr val="0563C1"/>
+      </a:hlink>
+      <a:folHlink>
+        <a:srgbClr val="954F72"/>
+      </a:folHlink>
+    </a:clrScheme>
+    <a:fontScheme name="Office">
+      <a:majorFont>
+        <a:latin typeface="Calibri Light" panose="020F0302020204030204"/>
+        <a:ea typeface=""/>
+        <a:cs typeface=""/>
+        <a:font script="Jpan" typeface="游ゴシック Light"/>
+        <a:font script="Hang" typeface="맑은 고딕"/>
+        <a:font script="Hans" typeface="等线 Light"/>
+        <a:font script="Hant" typeface="新細明體"/>
+        <a:font script="Arab" typeface="Times New Roman"/>
+        <a:font script="Hebr" typeface="Times New Roman"/>
+        <a:font script="Thai" typeface="Angsana New"/>
+        <a:font script="Ethi" typeface="Nyala"/>
+        <a:font script="Beng" typeface="Vrinda"/>
+        <a:font script="Gujr" typeface="Shruti"/>
+        <a:font script="Khmr" typeface="MoolBoran"/>
+        <a:font script="Knda" typeface="Tunga"/>
+        <a:font script="Guru" typeface="Raavi"/>
+        <a:font script="Cans" typeface="Euphemia"/>
+        <a:font script="Cher" typeface="Plantagenet Cherokee"/>
+        <a:font script="Yiii" typeface="Microsoft Yi Baiti"/>
+        <a:font script="Tibt" typeface="Microsoft Himalaya"/>
+        <a:font script="Thaa" typeface="MV Boli"/>
+        <a:font script="Deva" typeface="Mangal"/>
+        <a:font script="Telu" typeface="Gautami"/>
+        <a:font script="Taml" typeface="Latha"/>
+        <a:font script="Syrc" typeface="Estrangelo Edessa"/>
+        <a:font script="Orya" typeface="Kalinga"/>
+        <a:font script="Mlym" typeface="Kartika"/>
+        <a:font script="Laoo" typeface="DokChampa"/>
+        <a:font script="Sinh" typeface="Iskoola Pota"/>
+        <a:font script="Mong" typeface="Mongolian Baiti"/>
+        <a:font script="Viet" typeface="Times New Roman"/>
+        <a:font script="Uigh" typeface="Microsoft Uighur"/>
+        <a:font script="Geor" typeface="Sylfaen"/>
+        <a:font script="Armn" typeface="Arial"/>
+        <a:font script="Bugi" typeface="Leelawadee UI"/>
+        <a:font script="Bopo" typeface="Microsoft JhengHei"/>
+        <a:font script="Java" typeface="Javanese Text"/>
+        <a:font script="Lisu" typeface="Segoe UI"/>
+        <a:font script="Mymr" typeface="Myanmar Text"/>
+        <a:font script="Nkoo" typeface="Ebrima"/>
+        <a:font script="Olck" typeface="Nirmala UI"/>
+        <a:font script="Osma" typeface="Ebrima"/>
+        <a:font script="Phag" typeface="Phagspa"/>
+        <a:font script="Syrn" typeface="Estrangelo Edessa"/>
+        <a:font script="Syrj" typeface="Estrangelo Edessa"/>
+        <a:font script="Syre" typeface="Estrangelo Edessa"/>
+        <a:font script="Sora" typeface="Nirmala UI"/>
+        <a:font script="Tale" typeface="Microsoft Tai Le"/>
+        <a:font script="Talu" typeface="Microsoft New Tai Lue"/>
+        <a:font script="Tfng" typeface="Ebrima"/>
+      </a:majorFont>
+      <a:minorFont>
+        <a:latin typeface="Calibri" panose="020F0502020204030204"/>
+        <a:ea typeface=""/>
+        <a:cs typeface=""/>
+        <a:font script="Jpan" typeface="游明朝"/>
+        <a:font script="Hang" typeface="맑은 고딕"/>
+        <a:font script="Hans" typeface="等线"/>
+        <a:font script="Hant" typeface="新細明體"/>
+        <a:font script="Arab" typeface="Arial"/>
+        <a:font script="Hebr" typeface="Arial"/>
+        <a:font script="Thai" typeface="Cordia New"/>
+        <a:font script="Ethi" typeface="Nyala"/>
+        <a:font script="Beng" typeface="Vrinda"/>
+        <a:font script="Gujr" typeface="Shruti"/>
+        <a:font script="Khmr" typeface="DaunPenh"/>
+        <a:font script="Knda" typeface="Tunga"/>
+        <a:font script="Guru" typeface="Raavi"/>
+        <a:font script="Cans" typeface="Euphemia"/>
+        <a:font script="Cher" typeface="Plantagenet Cherokee"/>
+        <a:font script="Yiii" typeface="Microsoft Yi Baiti"/>
+        <a:font script="Tibt" typeface="Microsoft Himalaya"/>
+        <a:font script="Thaa" typeface="MV Boli"/>
+        <a:font script="Deva" typeface="Mangal"/>
+        <a:font script="Telu" typeface="Gautami"/>
+        <a:font script="Taml" typeface="Latha"/>
+        <a:font script="Syrc" typeface="Estrangelo Edessa"/>
+        <a:font script="Orya" typeface="Kalinga"/>
+        <a:font script="Mlym" typeface="Kartika"/>
+        <a:font script="Laoo" typeface="DokChampa"/>
+        <a:font script="Sinh" typeface="Iskoola Pota"/>
+        <a:font script="Mong" typeface="Mongolian Baiti"/>
+        <a:font script="Viet" typeface="Arial"/>
+        <a:font script="Uigh" typeface="Microsoft Uighur"/>
+        <a:font script="Geor" typeface="Sylfaen"/>
+        <a:font script="Armn" typeface="Arial"/>
+        <a:font script="Bugi" typeface="Leelawadee UI"/>
+        <a:font script="Bopo" typeface="Microsoft JhengHei"/>
+        <a:font script="Java" typeface="Javanese Text"/>
+        <a:font script="Lisu" typeface="Segoe UI"/>
+        <a:font script="Mymr" typeface="Myanmar Text"/>
+        <a:font script="Nkoo" typeface="Ebrima"/>
+        <a:font script="Olck" typeface="Nirmala UI"/>
+        <a:font script="Osma" typeface="Ebrima"/>
+        <a:font script="Phag" typeface="Phagspa"/>
+        <a:font script="Syrn" typeface="Estrangelo Edessa"/>
+        <a:font script="Syrj" typeface="Estrangelo Edessa"/>
+        <a:font script="Syre" typeface="Estrangelo Edessa"/>
+        <a:font script="Sora" typeface="Nirmala UI"/>
+        <a:font script="Tale" typeface="Microsoft Tai Le"/>
+        <a:font script="Talu" typeface="Microsoft New Tai Lue"/>
+        <a:font script="Tfng" typeface="Ebrima"/>
+      </a:minorFont>
+    </a:fontScheme>
+    <a:fmtScheme name="Office">
+      <a:fillStyleLst>
+        <a:solidFill>
+          <a:schemeClr val="phClr"/>
+        </a:solidFill>
+        <a:gradFill rotWithShape="true">
+          <a:gsLst>
+            <a:gs pos="0">
+              <a:schemeClr val="phClr">
+                <a:lumMod val="110000"/>
+                <a:satMod val="105000"/>
+                <a:tint val="67000"/>
+              </a:schemeClr>
+            </a:gs>
+            <a:gs pos="50000">
+              <a:schemeClr val="phClr">
+                <a:lumMod val="105000"/>
+                <a:satMod val="103000"/>
+                <a:tint val="73000"/>
+              </a:schemeClr>
+            </a:gs>
+            <a:gs pos="100000">
+              <a:schemeClr val="phClr">
+                <a:lumMod val="105000"/>
+                <a:satMod val="109000"/>
+                <a:tint val="81000"/>
+              </a:schemeClr>
+            </a:gs>
+          </a:gsLst>
+          <a:lin ang="5400000" scaled="false"/>
+        </a:gradFill>
+        <a:gradFill rotWithShape="true">
+          <a:gsLst>
+            <a:gs pos="0">
+              <a:schemeClr val="phClr">
+                <a:satMod val="103000"/>
+                <a:lumMod val="102000"/>
+                <a:tint val="94000"/>
+              </a:schemeClr>
+            </a:gs>
+            <a:gs pos="50000">
+              <a:schemeClr val="phClr">
+                <a:satMod val="110000"/>
+                <a:lumMod val="100000"/>
+                <a:shade val="100000"/>
+              </a:schemeClr>
+            </a:gs>
+            <a:gs pos="100000">
+              <a:schemeClr val="phClr">
+                <a:lumMod val="99000"/>
+                <a:satMod val="120000"/>
+                <a:shade val="78000"/>
+              </a:schemeClr>
+            </a:gs>
+          </a:gsLst>
+          <a:lin ang="5400000" scaled="false"/>
+        </a:gradFill>
+      </a:fillStyleLst>
+      <a:lnStyleLst>
+        <a:ln w="6350" cap="flat" cmpd="sng" algn="ctr">
+          <a:solidFill>
+            <a:schemeClr val="phClr"/>
+          </a:solidFill>
+          <a:prstDash val="solid"/>
+          <a:miter lim="800000"/>
+        </a:ln>
+        <a:ln w="12700" cap="flat" cmpd="sng" algn="ctr">
+          <a:solidFill>
+            <a:schemeClr val="phClr"/>
+          </a:solidFill>
+          <a:prstDash val="solid"/>
+          <a:miter lim="800000"/>
+        </a:ln>
+        <a:ln w="19050" cap="flat" cmpd="sng" algn="ctr">
+          <a:solidFill>
+            <a:schemeClr val="phClr"/>
+          </a:solidFill>
+          <a:prstDash val="solid"/>
+          <a:miter lim="800000"/>
+        </a:ln>
+      </a:lnStyleLst>
+      <a:effectStyleLst>
+        <a:effectStyle>
+          <a:effectLst/>
+        </a:effectStyle>
+        <a:effectStyle>
+          <a:effectLst/>
+        </a:effectStyle>
+        <a:effectStyle>
+          <a:effectLst>
+            <a:outerShdw blurRad="57150" dist="19050" dir="5400000" algn="ctr" rotWithShape="false">
+              <a:srgbClr val="000000">
+                <a:alpha val="63000"/>
+              </a:srgbClr>
+            </a:outerShdw>
+          </a:effectLst>
+        </a:effectStyle>
+      </a:effectStyleLst>
+      <a:bgFillStyleLst>
+        <a:solidFill>
+          <a:schemeClr val="phClr"/>
+        </a:solidFill>
+        <a:solidFill>
+          <a:schemeClr val="phClr">
+            <a:tint val="95000"/>
+            <a:satMod val="170000"/>
+          </a:schemeClr>
+        </a:solidFill>
+        <a:gradFill rotWithShape="true">
+          <a:gsLst>
+            <a:gs pos="0">
+              <a:schemeClr val="phClr">
+                <a:tint val="93000"/>
+                <a:satMod val="150000"/>
+                <a:shade val="98000"/>
+                <a:lumMod val="102000"/>
+              </a:schemeClr>
+            </a:gs>
+            <a:gs pos="50000">
+              <a:schemeClr val="phClr">
+                <a:tint val="98000"/>
+                <a:satMod val="130000"/>
+                <a:shade val="90000"/>
+                <a:lumMod val="103000"/>
+              </a:schemeClr>
+            </a:gs>
+            <a:gs pos="100000">
+              <a:schemeClr val="phClr">
+                <a:shade val="63000"/>
+                <a:satMod val="120000"/>
+              </a:schemeClr>
+            </a:gs>
+          </a:gsLst>
+          <a:lin ang="5400000" scaled="false"/>
+        </a:gradFill>
+      </a:bgFillStyleLst>
+    </a:fmtScheme>
+  </a:themeElements>
+  <a:objectDefaults/>
+  <a:extraClrSchemeLst/>
+</a:theme>
 </file>
</xml_diff>